<commit_message>
Correzione codice assignment 0,1,2 e riorganizzazione file
</commit_message>
<xml_diff>
--- a/ASSIGNMENTS/reports/Assignment0.docx
+++ b/ASSIGNMENTS/reports/Assignment0.docx
@@ -36,6 +36,7 @@
           <w:ilvl w:val="0"/>
           <w:numId w:val="41"/>
         </w:numPr>
+        <w:spacing w:before="0"/>
         <w:rPr>
           <w:b/>
           <w:bCs/>
@@ -59,19 +60,22 @@
         </w:rPr>
       </w:pPr>
       <w:r>
+        <w:rPr>
+          <w:noProof/>
+        </w:rPr>
         <w:drawing>
-          <wp:anchor distT="0" distB="0" distL="114300" distR="114300" simplePos="0" relativeHeight="251659264" behindDoc="0" locked="0" layoutInCell="1" allowOverlap="1" wp14:anchorId="4976863C" wp14:editId="2CDC5967">
+          <wp:anchor distT="0" distB="0" distL="114300" distR="114300" simplePos="0" relativeHeight="251659264" behindDoc="0" locked="0" layoutInCell="1" allowOverlap="1" wp14:anchorId="53445CF0" wp14:editId="6CDF6398">
             <wp:simplePos x="0" y="0"/>
-            <wp:positionH relativeFrom="margin">
-              <wp:posOffset>3704870</wp:posOffset>
+            <wp:positionH relativeFrom="column">
+              <wp:posOffset>3712744</wp:posOffset>
             </wp:positionH>
             <wp:positionV relativeFrom="paragraph">
-              <wp:posOffset>789178</wp:posOffset>
+              <wp:posOffset>774294</wp:posOffset>
             </wp:positionV>
-            <wp:extent cx="2143125" cy="2132330"/>
-            <wp:effectExtent l="0" t="0" r="9525" b="1270"/>
+            <wp:extent cx="2121408" cy="2110622"/>
+            <wp:effectExtent l="0" t="0" r="0" b="4445"/>
             <wp:wrapSquare wrapText="bothSides"/>
-            <wp:docPr id="4" name="Immagine 4"/>
+            <wp:docPr id="2" name="Immagine 2"/>
             <wp:cNvGraphicFramePr>
               <a:graphicFrameLocks xmlns:a="http://schemas.openxmlformats.org/drawingml/2006/main" noChangeAspect="1"/>
             </wp:cNvGraphicFramePr>
@@ -83,7 +87,7 @@
                     <pic:cNvPicPr/>
                   </pic:nvPicPr>
                   <pic:blipFill>
-                    <a:blip r:embed="rId6" cstate="print">
+                    <a:blip r:embed="rId8" cstate="print">
                       <a:extLst>
                         <a:ext uri="{28A0092B-C50C-407E-A947-70E740481C1C}">
                           <a14:useLocalDpi xmlns:a14="http://schemas.microsoft.com/office/drawing/2010/main" val="0"/>
@@ -97,7 +101,7 @@
                   <pic:spPr>
                     <a:xfrm>
                       <a:off x="0" y="0"/>
-                      <a:ext cx="2143125" cy="2132330"/>
+                      <a:ext cx="2121408" cy="2110622"/>
                     </a:xfrm>
                     <a:prstGeom prst="rect">
                       <a:avLst/>
@@ -106,12 +110,6 @@
                 </pic:pic>
               </a:graphicData>
             </a:graphic>
-            <wp14:sizeRelH relativeFrom="margin">
-              <wp14:pctWidth>0</wp14:pctWidth>
-            </wp14:sizeRelH>
-            <wp14:sizeRelV relativeFrom="margin">
-              <wp14:pctHeight>0</wp14:pctHeight>
-            </wp14:sizeRelV>
           </wp:anchor>
         </w:drawing>
       </w:r>
@@ -484,7 +482,7 @@
           <w:noProof/>
         </w:rPr>
         <w:drawing>
-          <wp:anchor distT="0" distB="0" distL="114300" distR="114300" simplePos="0" relativeHeight="251658240" behindDoc="0" locked="0" layoutInCell="1" allowOverlap="1" wp14:anchorId="70CB9D5B" wp14:editId="6A5330DA">
+          <wp:anchor distT="0" distB="0" distL="114300" distR="114300" simplePos="0" relativeHeight="251658240" behindDoc="0" locked="0" layoutInCell="1" allowOverlap="1" wp14:anchorId="70CB9D5B" wp14:editId="70924E03">
             <wp:simplePos x="0" y="0"/>
             <wp:positionH relativeFrom="column">
               <wp:posOffset>574725</wp:posOffset>
@@ -509,7 +507,7 @@
                     </pic:cNvPicPr>
                   </pic:nvPicPr>
                   <pic:blipFill>
-                    <a:blip r:embed="rId7" cstate="print">
+                    <a:blip r:embed="rId9" cstate="print">
                       <a:extLst>
                         <a:ext uri="{28A0092B-C50C-407E-A947-70E740481C1C}">
                           <a14:useLocalDpi xmlns:a14="http://schemas.microsoft.com/office/drawing/2010/main" val="0"/>
@@ -654,10 +652,7 @@
       </w:r>
       <w:r>
         <w:tab/>
-        <w:t xml:space="preserve">    </w:t>
-      </w:r>
-      <w:r>
-        <w:t xml:space="preserve">Figure </w:t>
+        <w:t xml:space="preserve">    Figure </w:t>
       </w:r>
       <w:r>
         <w:fldChar w:fldCharType="begin"/>
@@ -1882,15 +1877,6 @@
     </w:p>
     <w:p>
       <w:pPr>
-        <w:spacing w:after="0"/>
-        <w:rPr>
-          <w:sz w:val="24"/>
-          <w:szCs w:val="24"/>
-        </w:rPr>
-      </w:pPr>
-    </w:p>
-    <w:p>
-      <w:pPr>
         <w:pStyle w:val="Titolo2"/>
         <w:numPr>
           <w:ilvl w:val="0"/>
@@ -3064,7 +3050,35 @@
           <w:sz w:val="24"/>
           <w:szCs w:val="24"/>
         </w:rPr>
-        <w:t xml:space="preserve"> 1.93. </w:t>
+        <w:t xml:space="preserve"> 1</w:t>
+      </w:r>
+      <w:r>
+        <w:rPr>
+          <w:sz w:val="24"/>
+          <w:szCs w:val="24"/>
+        </w:rPr>
+        <w:t>.</w:t>
+      </w:r>
+      <w:r>
+        <w:rPr>
+          <w:sz w:val="24"/>
+          <w:szCs w:val="24"/>
+        </w:rPr>
+        <w:t>9</w:t>
+      </w:r>
+      <w:r>
+        <w:rPr>
+          <w:sz w:val="24"/>
+          <w:szCs w:val="24"/>
+        </w:rPr>
+        <w:t>4</w:t>
+      </w:r>
+      <w:r>
+        <w:rPr>
+          <w:sz w:val="24"/>
+          <w:szCs w:val="24"/>
+        </w:rPr>
+        <w:t xml:space="preserve">. </w:t>
       </w:r>
       <w:proofErr w:type="spellStart"/>
       <w:r>
@@ -3208,7 +3222,55 @@
           <w:sz w:val="24"/>
           <w:szCs w:val="24"/>
         </w:rPr>
-        <w:t xml:space="preserve"> can be </w:t>
+        <w:t xml:space="preserve"> </w:t>
+      </w:r>
+      <w:proofErr w:type="spellStart"/>
+      <w:r>
+        <w:rPr>
+          <w:sz w:val="24"/>
+          <w:szCs w:val="24"/>
+        </w:rPr>
+        <w:t>within</w:t>
+      </w:r>
+      <w:proofErr w:type="spellEnd"/>
+      <w:r>
+        <w:rPr>
+          <w:sz w:val="24"/>
+          <w:szCs w:val="24"/>
+        </w:rPr>
+        <w:t xml:space="preserve"> the </w:t>
+      </w:r>
+      <w:proofErr w:type="spellStart"/>
+      <w:r>
+        <w:rPr>
+          <w:sz w:val="24"/>
+          <w:szCs w:val="24"/>
+        </w:rPr>
+        <w:t>largest</w:t>
+      </w:r>
+      <w:proofErr w:type="spellEnd"/>
+      <w:r>
+        <w:rPr>
+          <w:sz w:val="24"/>
+          <w:szCs w:val="24"/>
+        </w:rPr>
+        <w:t xml:space="preserve"> </w:t>
+      </w:r>
+      <w:proofErr w:type="spellStart"/>
+      <w:r>
+        <w:rPr>
+          <w:sz w:val="24"/>
+          <w:szCs w:val="24"/>
+        </w:rPr>
+        <w:t>connected</w:t>
+      </w:r>
+      <w:proofErr w:type="spellEnd"/>
+      <w:r>
+        <w:rPr>
+          <w:sz w:val="24"/>
+          <w:szCs w:val="24"/>
+        </w:rPr>
+        <w:t xml:space="preserve"> component can be </w:t>
       </w:r>
       <w:proofErr w:type="spellStart"/>
       <w:r>
@@ -3224,15 +3286,15 @@
           <w:sz w:val="24"/>
           <w:szCs w:val="24"/>
         </w:rPr>
-        <w:t xml:space="preserve"> </w:t>
-      </w:r>
-      <w:proofErr w:type="spellStart"/>
-      <w:r>
-        <w:rPr>
-          <w:sz w:val="24"/>
-          <w:szCs w:val="24"/>
-        </w:rPr>
-        <w:t>through</w:t>
+        <w:t xml:space="preserve"> in </w:t>
+      </w:r>
+      <w:proofErr w:type="spellStart"/>
+      <w:r>
+        <w:rPr>
+          <w:sz w:val="24"/>
+          <w:szCs w:val="24"/>
+        </w:rPr>
+        <w:t>only</w:t>
       </w:r>
       <w:proofErr w:type="spellEnd"/>
       <w:r>
@@ -3248,31 +3310,15 @@
           <w:sz w:val="24"/>
           <w:szCs w:val="24"/>
         </w:rPr>
-        <w:t>very</w:t>
-      </w:r>
-      <w:proofErr w:type="spellEnd"/>
-      <w:r>
-        <w:rPr>
-          <w:sz w:val="24"/>
-          <w:szCs w:val="24"/>
-        </w:rPr>
-        <w:t xml:space="preserve"> small </w:t>
-      </w:r>
-      <w:proofErr w:type="spellStart"/>
-      <w:r>
-        <w:rPr>
-          <w:sz w:val="24"/>
-          <w:szCs w:val="24"/>
-        </w:rPr>
-        <w:t>number</w:t>
-      </w:r>
-      <w:proofErr w:type="spellEnd"/>
-      <w:r>
-        <w:rPr>
-          <w:sz w:val="24"/>
-          <w:szCs w:val="24"/>
-        </w:rPr>
-        <w:t xml:space="preserve"> of steps.</w:t>
+        <w:t>few</w:t>
+      </w:r>
+      <w:proofErr w:type="spellEnd"/>
+      <w:r>
+        <w:rPr>
+          <w:sz w:val="24"/>
+          <w:szCs w:val="24"/>
+        </w:rPr>
+        <w:t xml:space="preserve"> steps.</w:t>
       </w:r>
     </w:p>
     <w:p>
@@ -3738,7 +3784,35 @@
           <w:sz w:val="24"/>
           <w:szCs w:val="24"/>
         </w:rPr>
-        <w:t xml:space="preserve"> of 0.122 and an </w:t>
+        <w:t xml:space="preserve"> of 0</w:t>
+      </w:r>
+      <w:r>
+        <w:rPr>
+          <w:sz w:val="24"/>
+          <w:szCs w:val="24"/>
+        </w:rPr>
+        <w:t>.</w:t>
+      </w:r>
+      <w:r>
+        <w:rPr>
+          <w:sz w:val="24"/>
+          <w:szCs w:val="24"/>
+        </w:rPr>
+        <w:t>12</w:t>
+      </w:r>
+      <w:r>
+        <w:rPr>
+          <w:sz w:val="24"/>
+          <w:szCs w:val="24"/>
+        </w:rPr>
+        <w:t>18</w:t>
+      </w:r>
+      <w:r>
+        <w:rPr>
+          <w:sz w:val="24"/>
+          <w:szCs w:val="24"/>
+        </w:rPr>
+        <w:t xml:space="preserve"> and an </w:t>
       </w:r>
       <w:proofErr w:type="spellStart"/>
       <w:r>
@@ -3765,7 +3839,21 @@
           <w:sz w:val="24"/>
           <w:szCs w:val="24"/>
         </w:rPr>
-        <w:t xml:space="preserve"> of 436.10, </w:t>
+        <w:t xml:space="preserve"> of 436</w:t>
+      </w:r>
+      <w:r>
+        <w:rPr>
+          <w:sz w:val="24"/>
+          <w:szCs w:val="24"/>
+        </w:rPr>
+        <w:t>.</w:t>
+      </w:r>
+      <w:r>
+        <w:rPr>
+          <w:sz w:val="24"/>
+          <w:szCs w:val="24"/>
+        </w:rPr>
+        <w:t xml:space="preserve">10, </w:t>
       </w:r>
       <w:proofErr w:type="spellStart"/>
       <w:r>
@@ -3789,41 +3877,80 @@
           <w:sz w:val="24"/>
           <w:szCs w:val="24"/>
         </w:rPr>
-        <w:t>highly</w:t>
-      </w:r>
-      <w:proofErr w:type="spellEnd"/>
-      <w:r>
-        <w:rPr>
-          <w:sz w:val="24"/>
-          <w:szCs w:val="24"/>
-        </w:rPr>
-        <w:t xml:space="preserve"> </w:t>
-      </w:r>
-      <w:proofErr w:type="spellStart"/>
-      <w:r>
-        <w:rPr>
-          <w:sz w:val="24"/>
-          <w:szCs w:val="24"/>
-        </w:rPr>
-        <w:t>connected</w:t>
-      </w:r>
-      <w:proofErr w:type="spellEnd"/>
-      <w:r>
-        <w:rPr>
-          <w:sz w:val="24"/>
-          <w:szCs w:val="24"/>
-        </w:rPr>
-        <w:t xml:space="preserve"> </w:t>
-      </w:r>
-      <w:proofErr w:type="spellStart"/>
-      <w:r>
-        <w:rPr>
-          <w:sz w:val="24"/>
-          <w:szCs w:val="24"/>
-        </w:rPr>
-        <w:t>structure</w:t>
-      </w:r>
-      <w:proofErr w:type="spellEnd"/>
+        <w:t>relatively</w:t>
+      </w:r>
+      <w:proofErr w:type="spellEnd"/>
+      <w:r>
+        <w:rPr>
+          <w:sz w:val="24"/>
+          <w:szCs w:val="24"/>
+        </w:rPr>
+        <w:t xml:space="preserve"> dense </w:t>
+      </w:r>
+      <w:proofErr w:type="spellStart"/>
+      <w:r>
+        <w:rPr>
+          <w:sz w:val="24"/>
+          <w:szCs w:val="24"/>
+        </w:rPr>
+        <w:t>similarity</w:t>
+      </w:r>
+      <w:proofErr w:type="spellEnd"/>
+      <w:r>
+        <w:rPr>
+          <w:sz w:val="24"/>
+          <w:szCs w:val="24"/>
+        </w:rPr>
+        <w:t xml:space="preserve"> network </w:t>
+      </w:r>
+      <w:proofErr w:type="spellStart"/>
+      <w:r>
+        <w:rPr>
+          <w:sz w:val="24"/>
+          <w:szCs w:val="24"/>
+        </w:rPr>
+        <w:t>compared</w:t>
+      </w:r>
+      <w:proofErr w:type="spellEnd"/>
+      <w:r>
+        <w:rPr>
+          <w:sz w:val="24"/>
+          <w:szCs w:val="24"/>
+        </w:rPr>
+        <w:t xml:space="preserve"> to </w:t>
+      </w:r>
+      <w:proofErr w:type="spellStart"/>
+      <w:r>
+        <w:rPr>
+          <w:sz w:val="24"/>
+          <w:szCs w:val="24"/>
+        </w:rPr>
+        <w:t>most</w:t>
+      </w:r>
+      <w:proofErr w:type="spellEnd"/>
+      <w:r>
+        <w:rPr>
+          <w:sz w:val="24"/>
+          <w:szCs w:val="24"/>
+        </w:rPr>
+        <w:t xml:space="preserve"> </w:t>
+      </w:r>
+      <w:proofErr w:type="spellStart"/>
+      <w:r>
+        <w:rPr>
+          <w:sz w:val="24"/>
+          <w:szCs w:val="24"/>
+        </w:rPr>
+        <w:t>real</w:t>
+      </w:r>
+      <w:proofErr w:type="spellEnd"/>
+      <w:r>
+        <w:rPr>
+          <w:sz w:val="24"/>
+          <w:szCs w:val="24"/>
+        </w:rPr>
+        <w:t>-world social networks</w:t>
+      </w:r>
       <w:r>
         <w:rPr>
           <w:sz w:val="24"/>
@@ -3883,55 +4010,291 @@
           <w:sz w:val="24"/>
           <w:szCs w:val="24"/>
         </w:rPr>
-        <w:t xml:space="preserve"> 0.63, </w:t>
-      </w:r>
-      <w:proofErr w:type="spellStart"/>
-      <w:r>
-        <w:rPr>
-          <w:sz w:val="24"/>
-          <w:szCs w:val="24"/>
-        </w:rPr>
-        <w:t>reflecting</w:t>
-      </w:r>
-      <w:proofErr w:type="spellEnd"/>
-      <w:r>
-        <w:rPr>
-          <w:sz w:val="24"/>
-          <w:szCs w:val="24"/>
-        </w:rPr>
-        <w:t xml:space="preserve"> strong </w:t>
-      </w:r>
-      <w:proofErr w:type="spellStart"/>
-      <w:r>
-        <w:rPr>
-          <w:sz w:val="24"/>
-          <w:szCs w:val="24"/>
-        </w:rPr>
-        <w:t>local</w:t>
-      </w:r>
-      <w:proofErr w:type="spellEnd"/>
-      <w:r>
-        <w:rPr>
-          <w:sz w:val="24"/>
-          <w:szCs w:val="24"/>
-        </w:rPr>
-        <w:t xml:space="preserve"> </w:t>
-      </w:r>
-      <w:proofErr w:type="spellStart"/>
-      <w:r>
-        <w:rPr>
-          <w:sz w:val="24"/>
-          <w:szCs w:val="24"/>
-        </w:rPr>
-        <w:t>connectivity</w:t>
-      </w:r>
-      <w:proofErr w:type="spellEnd"/>
-      <w:r>
-        <w:rPr>
-          <w:sz w:val="24"/>
-          <w:szCs w:val="24"/>
-        </w:rPr>
-        <w:t xml:space="preserve"> due to </w:t>
+        <w:t xml:space="preserve"> 0</w:t>
+      </w:r>
+      <w:r>
+        <w:rPr>
+          <w:sz w:val="24"/>
+          <w:szCs w:val="24"/>
+        </w:rPr>
+        <w:t>.</w:t>
+      </w:r>
+      <w:r>
+        <w:rPr>
+          <w:sz w:val="24"/>
+          <w:szCs w:val="24"/>
+        </w:rPr>
+        <w:t>6</w:t>
+      </w:r>
+      <w:r>
+        <w:rPr>
+          <w:sz w:val="24"/>
+          <w:szCs w:val="24"/>
+        </w:rPr>
+        <w:t>25</w:t>
+      </w:r>
+      <w:r>
+        <w:rPr>
+          <w:sz w:val="24"/>
+          <w:szCs w:val="24"/>
+        </w:rPr>
+        <w:t xml:space="preserve">, </w:t>
+      </w:r>
+      <w:proofErr w:type="spellStart"/>
+      <w:r>
+        <w:rPr>
+          <w:sz w:val="24"/>
+          <w:szCs w:val="24"/>
+        </w:rPr>
+        <w:t>indicating</w:t>
+      </w:r>
+      <w:proofErr w:type="spellEnd"/>
+      <w:r>
+        <w:rPr>
+          <w:sz w:val="24"/>
+          <w:szCs w:val="24"/>
+        </w:rPr>
+        <w:t xml:space="preserve"> </w:t>
+      </w:r>
+      <w:proofErr w:type="spellStart"/>
+      <w:r>
+        <w:rPr>
+          <w:sz w:val="24"/>
+          <w:szCs w:val="24"/>
+        </w:rPr>
+        <w:t>that</w:t>
+      </w:r>
+      <w:proofErr w:type="spellEnd"/>
+      <w:r>
+        <w:rPr>
+          <w:sz w:val="24"/>
+          <w:szCs w:val="24"/>
+        </w:rPr>
+        <w:t xml:space="preserve"> </w:t>
+      </w:r>
+      <w:proofErr w:type="spellStart"/>
+      <w:r>
+        <w:rPr>
+          <w:sz w:val="24"/>
+          <w:szCs w:val="24"/>
+        </w:rPr>
+        <w:t>nodes</w:t>
+      </w:r>
+      <w:proofErr w:type="spellEnd"/>
+      <w:r>
+        <w:rPr>
+          <w:sz w:val="24"/>
+          <w:szCs w:val="24"/>
+        </w:rPr>
+        <w:t xml:space="preserve"> </w:t>
+      </w:r>
+      <w:proofErr w:type="spellStart"/>
+      <w:r>
+        <w:rPr>
+          <w:sz w:val="24"/>
+          <w:szCs w:val="24"/>
+        </w:rPr>
+        <w:t>connected</w:t>
+      </w:r>
+      <w:proofErr w:type="spellEnd"/>
+      <w:r>
+        <w:rPr>
+          <w:sz w:val="24"/>
+          <w:szCs w:val="24"/>
+        </w:rPr>
+        <w:t xml:space="preserve"> to the </w:t>
+      </w:r>
+      <w:proofErr w:type="spellStart"/>
+      <w:r>
+        <w:rPr>
+          <w:sz w:val="24"/>
+          <w:szCs w:val="24"/>
+        </w:rPr>
+        <w:t>same</w:t>
+      </w:r>
+      <w:proofErr w:type="spellEnd"/>
+      <w:r>
+        <w:rPr>
+          <w:sz w:val="24"/>
+          <w:szCs w:val="24"/>
+        </w:rPr>
+        <w:t xml:space="preserve"> </w:t>
+      </w:r>
+      <w:proofErr w:type="spellStart"/>
+      <w:r>
+        <w:rPr>
+          <w:sz w:val="24"/>
+          <w:szCs w:val="24"/>
+        </w:rPr>
+        <w:t>node</w:t>
+      </w:r>
+      <w:proofErr w:type="spellEnd"/>
+      <w:r>
+        <w:rPr>
+          <w:sz w:val="24"/>
+          <w:szCs w:val="24"/>
+        </w:rPr>
+        <w:t xml:space="preserve"> are </w:t>
+      </w:r>
+      <w:proofErr w:type="spellStart"/>
+      <w:r>
+        <w:rPr>
+          <w:sz w:val="24"/>
+          <w:szCs w:val="24"/>
+        </w:rPr>
+        <w:t>also</w:t>
+      </w:r>
+      <w:proofErr w:type="spellEnd"/>
+      <w:r>
+        <w:rPr>
+          <w:sz w:val="24"/>
+          <w:szCs w:val="24"/>
+        </w:rPr>
+        <w:t xml:space="preserve"> </w:t>
+      </w:r>
+      <w:proofErr w:type="spellStart"/>
+      <w:r>
+        <w:rPr>
+          <w:sz w:val="24"/>
+          <w:szCs w:val="24"/>
+        </w:rPr>
+        <w:t>likely</w:t>
+      </w:r>
+      <w:proofErr w:type="spellEnd"/>
+      <w:r>
+        <w:rPr>
+          <w:sz w:val="24"/>
+          <w:szCs w:val="24"/>
+        </w:rPr>
+        <w:t xml:space="preserve"> to be </w:t>
+      </w:r>
+      <w:proofErr w:type="spellStart"/>
+      <w:r>
+        <w:rPr>
+          <w:sz w:val="24"/>
+          <w:szCs w:val="24"/>
+        </w:rPr>
+        <w:t>connected</w:t>
+      </w:r>
+      <w:proofErr w:type="spellEnd"/>
+      <w:r>
+        <w:rPr>
+          <w:sz w:val="24"/>
+          <w:szCs w:val="24"/>
+        </w:rPr>
+        <w:t xml:space="preserve"> to one </w:t>
+      </w:r>
+      <w:proofErr w:type="spellStart"/>
+      <w:r>
+        <w:rPr>
+          <w:sz w:val="24"/>
+          <w:szCs w:val="24"/>
+        </w:rPr>
+        <w:t>another</w:t>
+      </w:r>
+      <w:proofErr w:type="spellEnd"/>
+      <w:r>
+        <w:rPr>
+          <w:sz w:val="24"/>
+          <w:szCs w:val="24"/>
+        </w:rPr>
+        <w:t xml:space="preserve">, </w:t>
+      </w:r>
+      <w:proofErr w:type="spellStart"/>
+      <w:r>
+        <w:rPr>
+          <w:sz w:val="24"/>
+          <w:szCs w:val="24"/>
+        </w:rPr>
+        <w:t>which</w:t>
+      </w:r>
+      <w:proofErr w:type="spellEnd"/>
+      <w:r>
+        <w:rPr>
+          <w:sz w:val="24"/>
+          <w:szCs w:val="24"/>
+        </w:rPr>
+        <w:t xml:space="preserve"> </w:t>
+      </w:r>
+      <w:proofErr w:type="spellStart"/>
+      <w:r>
+        <w:rPr>
+          <w:sz w:val="24"/>
+          <w:szCs w:val="24"/>
+        </w:rPr>
+        <w:t>is</w:t>
+      </w:r>
+      <w:proofErr w:type="spellEnd"/>
+      <w:r>
+        <w:rPr>
+          <w:sz w:val="24"/>
+          <w:szCs w:val="24"/>
+        </w:rPr>
+        <w:t xml:space="preserve"> </w:t>
+      </w:r>
+      <w:proofErr w:type="spellStart"/>
+      <w:r>
+        <w:rPr>
+          <w:sz w:val="24"/>
+          <w:szCs w:val="24"/>
+        </w:rPr>
+        <w:t>consistent</w:t>
+      </w:r>
+      <w:proofErr w:type="spellEnd"/>
+      <w:r>
+        <w:rPr>
+          <w:sz w:val="24"/>
+          <w:szCs w:val="24"/>
+        </w:rPr>
+        <w:t xml:space="preserve"> with the </w:t>
+      </w:r>
+      <w:proofErr w:type="spellStart"/>
+      <w:r>
+        <w:rPr>
+          <w:sz w:val="24"/>
+          <w:szCs w:val="24"/>
+        </w:rPr>
+        <w:t>graph</w:t>
+      </w:r>
+      <w:proofErr w:type="spellEnd"/>
+      <w:r>
+        <w:rPr>
+          <w:sz w:val="24"/>
+          <w:szCs w:val="24"/>
+        </w:rPr>
+        <w:t xml:space="preserve"> </w:t>
+      </w:r>
+      <w:proofErr w:type="spellStart"/>
+      <w:r>
+        <w:rPr>
+          <w:sz w:val="24"/>
+          <w:szCs w:val="24"/>
+        </w:rPr>
+        <w:t>construction</w:t>
+      </w:r>
+      <w:proofErr w:type="spellEnd"/>
+      <w:r>
+        <w:rPr>
+          <w:sz w:val="24"/>
+          <w:szCs w:val="24"/>
+        </w:rPr>
+        <w:t xml:space="preserve"> </w:t>
+      </w:r>
+      <w:proofErr w:type="spellStart"/>
+      <w:r>
+        <w:rPr>
+          <w:sz w:val="24"/>
+          <w:szCs w:val="24"/>
+        </w:rPr>
+        <w:t>based</w:t>
+      </w:r>
+      <w:proofErr w:type="spellEnd"/>
+      <w:r>
+        <w:rPr>
+          <w:sz w:val="24"/>
+          <w:szCs w:val="24"/>
+        </w:rPr>
+        <w:t xml:space="preserve"> on </w:t>
       </w:r>
       <w:proofErr w:type="spellStart"/>
       <w:r>
@@ -3949,37 +4312,42 @@
         </w:rPr>
         <w:t xml:space="preserve"> </w:t>
       </w:r>
-      <w:proofErr w:type="spellStart"/>
-      <w:r>
-        <w:rPr>
-          <w:sz w:val="24"/>
-          <w:szCs w:val="24"/>
-        </w:rPr>
-        <w:t>genre</w:t>
-      </w:r>
-      <w:proofErr w:type="spellEnd"/>
-      <w:r>
-        <w:rPr>
-          <w:sz w:val="24"/>
-          <w:szCs w:val="24"/>
-        </w:rPr>
-        <w:t xml:space="preserve"> </w:t>
-      </w:r>
-      <w:proofErr w:type="spellStart"/>
-      <w:r>
-        <w:rPr>
-          <w:sz w:val="24"/>
-          <w:szCs w:val="24"/>
-        </w:rPr>
-        <w:t>overlap</w:t>
-      </w:r>
-      <w:proofErr w:type="spellEnd"/>
-      <w:r>
-        <w:rPr>
-          <w:sz w:val="24"/>
-          <w:szCs w:val="24"/>
-        </w:rPr>
-        <w:t xml:space="preserve">. The </w:t>
+      <w:r>
+        <w:rPr>
+          <w:sz w:val="24"/>
+          <w:szCs w:val="24"/>
+        </w:rPr>
+        <w:t>anime</w:t>
+      </w:r>
+      <w:r>
+        <w:rPr>
+          <w:sz w:val="24"/>
+          <w:szCs w:val="24"/>
+        </w:rPr>
+        <w:t xml:space="preserve"> </w:t>
+      </w:r>
+      <w:proofErr w:type="spellStart"/>
+      <w:r>
+        <w:rPr>
+          <w:sz w:val="24"/>
+          <w:szCs w:val="24"/>
+        </w:rPr>
+        <w:t>genres</w:t>
+      </w:r>
+      <w:proofErr w:type="spellEnd"/>
+      <w:r>
+        <w:rPr>
+          <w:sz w:val="24"/>
+          <w:szCs w:val="24"/>
+        </w:rPr>
+        <w:t>.</w:t>
+      </w:r>
+      <w:r>
+        <w:rPr>
+          <w:sz w:val="24"/>
+          <w:szCs w:val="24"/>
+        </w:rPr>
+        <w:t xml:space="preserve"> The </w:t>
       </w:r>
       <w:proofErr w:type="spellStart"/>
       <w:r>
@@ -4033,7 +4401,35 @@
           <w:sz w:val="24"/>
           <w:szCs w:val="24"/>
         </w:rPr>
-        <w:t xml:space="preserve"> 0.17, </w:t>
+        <w:t xml:space="preserve"> 0</w:t>
+      </w:r>
+      <w:r>
+        <w:rPr>
+          <w:sz w:val="24"/>
+          <w:szCs w:val="24"/>
+        </w:rPr>
+        <w:t>.</w:t>
+      </w:r>
+      <w:r>
+        <w:rPr>
+          <w:sz w:val="24"/>
+          <w:szCs w:val="24"/>
+        </w:rPr>
+        <w:t>17</w:t>
+      </w:r>
+      <w:r>
+        <w:rPr>
+          <w:sz w:val="24"/>
+          <w:szCs w:val="24"/>
+        </w:rPr>
+        <w:t>4</w:t>
+      </w:r>
+      <w:r>
+        <w:rPr>
+          <w:sz w:val="24"/>
+          <w:szCs w:val="24"/>
+        </w:rPr>
+        <w:t xml:space="preserve">, </w:t>
       </w:r>
       <w:proofErr w:type="spellStart"/>
       <w:r>
@@ -4359,8 +4755,764 @@
           <w:sz w:val="24"/>
           <w:szCs w:val="24"/>
         </w:rPr>
+        <w:t>: anime</w:t>
+      </w:r>
+      <w:r>
+        <w:rPr>
+          <w:sz w:val="24"/>
+          <w:szCs w:val="24"/>
+        </w:rPr>
+        <w:t xml:space="preserve"> with </w:t>
+      </w:r>
+      <w:proofErr w:type="spellStart"/>
+      <w:r>
+        <w:rPr>
+          <w:sz w:val="24"/>
+          <w:szCs w:val="24"/>
+        </w:rPr>
+        <w:t>uncommon</w:t>
+      </w:r>
+      <w:proofErr w:type="spellEnd"/>
+      <w:r>
+        <w:rPr>
+          <w:sz w:val="24"/>
+          <w:szCs w:val="24"/>
+        </w:rPr>
+        <w:t xml:space="preserve"> or </w:t>
+      </w:r>
+      <w:proofErr w:type="spellStart"/>
+      <w:r>
+        <w:rPr>
+          <w:sz w:val="24"/>
+          <w:szCs w:val="24"/>
+        </w:rPr>
+        <w:t>highly</w:t>
+      </w:r>
+      <w:proofErr w:type="spellEnd"/>
+      <w:r>
+        <w:rPr>
+          <w:sz w:val="24"/>
+          <w:szCs w:val="24"/>
+        </w:rPr>
+        <w:t xml:space="preserve"> </w:t>
+      </w:r>
+      <w:proofErr w:type="spellStart"/>
+      <w:r>
+        <w:rPr>
+          <w:sz w:val="24"/>
+          <w:szCs w:val="24"/>
+        </w:rPr>
+        <w:t>specific</w:t>
+      </w:r>
+      <w:proofErr w:type="spellEnd"/>
+      <w:r>
+        <w:rPr>
+          <w:sz w:val="24"/>
+          <w:szCs w:val="24"/>
+        </w:rPr>
+        <w:t xml:space="preserve"> </w:t>
+      </w:r>
+      <w:proofErr w:type="spellStart"/>
+      <w:r>
+        <w:rPr>
+          <w:sz w:val="24"/>
+          <w:szCs w:val="24"/>
+        </w:rPr>
+        <w:t>genre</w:t>
+      </w:r>
+      <w:proofErr w:type="spellEnd"/>
+      <w:r>
+        <w:rPr>
+          <w:sz w:val="24"/>
+          <w:szCs w:val="24"/>
+        </w:rPr>
+        <w:t xml:space="preserve"> </w:t>
+      </w:r>
+      <w:proofErr w:type="spellStart"/>
+      <w:r>
+        <w:rPr>
+          <w:sz w:val="24"/>
+          <w:szCs w:val="24"/>
+        </w:rPr>
+        <w:t>combinations</w:t>
+      </w:r>
+      <w:proofErr w:type="spellEnd"/>
+      <w:r>
+        <w:rPr>
+          <w:sz w:val="24"/>
+          <w:szCs w:val="24"/>
+        </w:rPr>
+        <w:t xml:space="preserve"> </w:t>
+      </w:r>
+      <w:proofErr w:type="spellStart"/>
+      <w:r>
+        <w:rPr>
+          <w:sz w:val="24"/>
+          <w:szCs w:val="24"/>
+        </w:rPr>
+        <w:t>fail</w:t>
+      </w:r>
+      <w:proofErr w:type="spellEnd"/>
+      <w:r>
+        <w:rPr>
+          <w:sz w:val="24"/>
+          <w:szCs w:val="24"/>
+        </w:rPr>
+        <w:t xml:space="preserve"> to </w:t>
+      </w:r>
+      <w:proofErr w:type="spellStart"/>
+      <w:r>
+        <w:rPr>
+          <w:sz w:val="24"/>
+          <w:szCs w:val="24"/>
+        </w:rPr>
+        <w:t>reach</w:t>
+      </w:r>
+      <w:proofErr w:type="spellEnd"/>
+      <w:r>
+        <w:rPr>
+          <w:sz w:val="24"/>
+          <w:szCs w:val="24"/>
+        </w:rPr>
+        <w:t xml:space="preserve"> the </w:t>
+      </w:r>
+      <w:proofErr w:type="spellStart"/>
+      <w:r>
+        <w:rPr>
+          <w:sz w:val="24"/>
+          <w:szCs w:val="24"/>
+        </w:rPr>
+        <w:t>similarity</w:t>
+      </w:r>
+      <w:proofErr w:type="spellEnd"/>
+      <w:r>
+        <w:rPr>
+          <w:sz w:val="24"/>
+          <w:szCs w:val="24"/>
+        </w:rPr>
+        <w:t xml:space="preserve"> </w:t>
+      </w:r>
+      <w:proofErr w:type="spellStart"/>
+      <w:r>
+        <w:rPr>
+          <w:sz w:val="24"/>
+          <w:szCs w:val="24"/>
+        </w:rPr>
+        <w:t>threshold</w:t>
+      </w:r>
+      <w:proofErr w:type="spellEnd"/>
+      <w:r>
+        <w:rPr>
+          <w:sz w:val="24"/>
+          <w:szCs w:val="24"/>
+        </w:rPr>
+        <w:t xml:space="preserve"> with the </w:t>
+      </w:r>
+      <w:proofErr w:type="spellStart"/>
+      <w:r>
+        <w:rPr>
+          <w:sz w:val="24"/>
+          <w:szCs w:val="24"/>
+        </w:rPr>
+        <w:t>rest</w:t>
+      </w:r>
+      <w:proofErr w:type="spellEnd"/>
+      <w:r>
+        <w:rPr>
+          <w:sz w:val="24"/>
+          <w:szCs w:val="24"/>
+        </w:rPr>
+        <w:t xml:space="preserve"> of the network, </w:t>
+      </w:r>
+      <w:proofErr w:type="spellStart"/>
+      <w:r>
+        <w:rPr>
+          <w:sz w:val="24"/>
+          <w:szCs w:val="24"/>
+        </w:rPr>
+        <w:t>forming</w:t>
+      </w:r>
+      <w:proofErr w:type="spellEnd"/>
+      <w:r>
+        <w:rPr>
+          <w:sz w:val="24"/>
+          <w:szCs w:val="24"/>
+        </w:rPr>
+        <w:t xml:space="preserve"> </w:t>
+      </w:r>
+      <w:proofErr w:type="spellStart"/>
+      <w:r>
+        <w:rPr>
+          <w:sz w:val="24"/>
+          <w:szCs w:val="24"/>
+        </w:rPr>
+        <w:t>isolated</w:t>
+      </w:r>
+      <w:proofErr w:type="spellEnd"/>
+      <w:r>
+        <w:rPr>
+          <w:sz w:val="24"/>
+          <w:szCs w:val="24"/>
+        </w:rPr>
+        <w:t xml:space="preserve"> </w:t>
+      </w:r>
+      <w:proofErr w:type="spellStart"/>
+      <w:r>
+        <w:rPr>
+          <w:sz w:val="24"/>
+          <w:szCs w:val="24"/>
+        </w:rPr>
+        <w:t>components</w:t>
+      </w:r>
+      <w:proofErr w:type="spellEnd"/>
+      <w:r>
+        <w:rPr>
+          <w:sz w:val="24"/>
+          <w:szCs w:val="24"/>
+        </w:rPr>
         <w:t>.</w:t>
       </w:r>
+    </w:p>
+    <w:p>
+      <w:pPr>
+        <w:pStyle w:val="Nessunaspaziatura"/>
+        <w:keepNext/>
+        <w:spacing w:before="240"/>
+      </w:pPr>
+      <w:r>
+        <w:rPr>
+          <w:sz w:val="24"/>
+          <w:szCs w:val="24"/>
+        </w:rPr>
+        <w:t xml:space="preserve">Degree </w:t>
+      </w:r>
+      <w:proofErr w:type="spellStart"/>
+      <w:r>
+        <w:rPr>
+          <w:sz w:val="24"/>
+          <w:szCs w:val="24"/>
+        </w:rPr>
+        <w:t>centrality</w:t>
+      </w:r>
+      <w:proofErr w:type="spellEnd"/>
+      <w:r>
+        <w:rPr>
+          <w:sz w:val="24"/>
+          <w:szCs w:val="24"/>
+        </w:rPr>
+        <w:t xml:space="preserve"> </w:t>
+      </w:r>
+      <w:proofErr w:type="spellStart"/>
+      <w:r>
+        <w:rPr>
+          <w:sz w:val="24"/>
+          <w:szCs w:val="24"/>
+        </w:rPr>
+        <w:t>was</w:t>
+      </w:r>
+      <w:proofErr w:type="spellEnd"/>
+      <w:r>
+        <w:rPr>
+          <w:sz w:val="24"/>
+          <w:szCs w:val="24"/>
+        </w:rPr>
+        <w:t xml:space="preserve"> </w:t>
+      </w:r>
+      <w:proofErr w:type="spellStart"/>
+      <w:r>
+        <w:rPr>
+          <w:sz w:val="24"/>
+          <w:szCs w:val="24"/>
+        </w:rPr>
+        <w:t>computed</w:t>
+      </w:r>
+      <w:proofErr w:type="spellEnd"/>
+      <w:r>
+        <w:rPr>
+          <w:sz w:val="24"/>
+          <w:szCs w:val="24"/>
+        </w:rPr>
+        <w:t xml:space="preserve"> to </w:t>
+      </w:r>
+      <w:proofErr w:type="spellStart"/>
+      <w:r>
+        <w:rPr>
+          <w:sz w:val="24"/>
+          <w:szCs w:val="24"/>
+        </w:rPr>
+        <w:t>identify</w:t>
+      </w:r>
+      <w:proofErr w:type="spellEnd"/>
+      <w:r>
+        <w:rPr>
+          <w:sz w:val="24"/>
+          <w:szCs w:val="24"/>
+        </w:rPr>
+        <w:t xml:space="preserve"> </w:t>
+      </w:r>
+      <w:proofErr w:type="spellStart"/>
+      <w:r>
+        <w:rPr>
+          <w:sz w:val="24"/>
+          <w:szCs w:val="24"/>
+        </w:rPr>
+        <w:t>important</w:t>
+      </w:r>
+      <w:proofErr w:type="spellEnd"/>
+      <w:r>
+        <w:rPr>
+          <w:sz w:val="24"/>
+          <w:szCs w:val="24"/>
+        </w:rPr>
+        <w:t xml:space="preserve"> </w:t>
+      </w:r>
+      <w:proofErr w:type="spellStart"/>
+      <w:r>
+        <w:rPr>
+          <w:sz w:val="24"/>
+          <w:szCs w:val="24"/>
+        </w:rPr>
+        <w:t>nodes</w:t>
+      </w:r>
+      <w:proofErr w:type="spellEnd"/>
+      <w:r>
+        <w:rPr>
+          <w:sz w:val="24"/>
+          <w:szCs w:val="24"/>
+        </w:rPr>
+        <w:t xml:space="preserve"> in the </w:t>
+      </w:r>
+      <w:proofErr w:type="spellStart"/>
+      <w:r>
+        <w:rPr>
+          <w:sz w:val="24"/>
+          <w:szCs w:val="24"/>
+        </w:rPr>
+        <w:t>genre</w:t>
+      </w:r>
+      <w:proofErr w:type="spellEnd"/>
+      <w:r>
+        <w:rPr>
+          <w:sz w:val="24"/>
+          <w:szCs w:val="24"/>
+        </w:rPr>
+        <w:t xml:space="preserve"> </w:t>
+      </w:r>
+      <w:proofErr w:type="spellStart"/>
+      <w:r>
+        <w:rPr>
+          <w:sz w:val="24"/>
+          <w:szCs w:val="24"/>
+        </w:rPr>
+        <w:t>similarity</w:t>
+      </w:r>
+      <w:proofErr w:type="spellEnd"/>
+      <w:r>
+        <w:rPr>
+          <w:sz w:val="24"/>
+          <w:szCs w:val="24"/>
+        </w:rPr>
+        <w:t xml:space="preserve"> network. The </w:t>
+      </w:r>
+      <w:proofErr w:type="spellStart"/>
+      <w:r>
+        <w:rPr>
+          <w:sz w:val="24"/>
+          <w:szCs w:val="24"/>
+        </w:rPr>
+        <w:t>most</w:t>
+      </w:r>
+      <w:proofErr w:type="spellEnd"/>
+      <w:r>
+        <w:rPr>
+          <w:sz w:val="24"/>
+          <w:szCs w:val="24"/>
+        </w:rPr>
+        <w:t xml:space="preserve"> </w:t>
+      </w:r>
+      <w:proofErr w:type="spellStart"/>
+      <w:r>
+        <w:rPr>
+          <w:sz w:val="24"/>
+          <w:szCs w:val="24"/>
+        </w:rPr>
+        <w:t>central</w:t>
+      </w:r>
+      <w:proofErr w:type="spellEnd"/>
+      <w:r>
+        <w:rPr>
+          <w:sz w:val="24"/>
+          <w:szCs w:val="24"/>
+        </w:rPr>
+        <w:t xml:space="preserve"> anime are </w:t>
+      </w:r>
+      <w:proofErr w:type="spellStart"/>
+      <w:r>
+        <w:rPr>
+          <w:sz w:val="24"/>
+          <w:szCs w:val="24"/>
+        </w:rPr>
+        <w:t>shown</w:t>
+      </w:r>
+      <w:proofErr w:type="spellEnd"/>
+      <w:r>
+        <w:rPr>
+          <w:sz w:val="24"/>
+          <w:szCs w:val="24"/>
+        </w:rPr>
+        <w:t xml:space="preserve"> in Figure 3. </w:t>
+      </w:r>
+      <w:proofErr w:type="spellStart"/>
+      <w:r>
+        <w:rPr>
+          <w:sz w:val="24"/>
+          <w:szCs w:val="24"/>
+        </w:rPr>
+        <w:t>These</w:t>
+      </w:r>
+      <w:proofErr w:type="spellEnd"/>
+      <w:r>
+        <w:rPr>
+          <w:sz w:val="24"/>
+          <w:szCs w:val="24"/>
+        </w:rPr>
+        <w:t xml:space="preserve"> </w:t>
+      </w:r>
+      <w:proofErr w:type="spellStart"/>
+      <w:r>
+        <w:rPr>
+          <w:sz w:val="24"/>
+          <w:szCs w:val="24"/>
+        </w:rPr>
+        <w:t>nodes</w:t>
+      </w:r>
+      <w:proofErr w:type="spellEnd"/>
+      <w:r>
+        <w:rPr>
+          <w:sz w:val="24"/>
+          <w:szCs w:val="24"/>
+        </w:rPr>
+        <w:t xml:space="preserve"> act </w:t>
+      </w:r>
+      <w:proofErr w:type="spellStart"/>
+      <w:r>
+        <w:rPr>
+          <w:sz w:val="24"/>
+          <w:szCs w:val="24"/>
+        </w:rPr>
+        <w:t>as</w:t>
+      </w:r>
+      <w:proofErr w:type="spellEnd"/>
+      <w:r>
+        <w:rPr>
+          <w:sz w:val="24"/>
+          <w:szCs w:val="24"/>
+        </w:rPr>
+        <w:t xml:space="preserve"> hubs </w:t>
+      </w:r>
+      <w:proofErr w:type="spellStart"/>
+      <w:r>
+        <w:rPr>
+          <w:sz w:val="24"/>
+          <w:szCs w:val="24"/>
+        </w:rPr>
+        <w:t>because</w:t>
+      </w:r>
+      <w:proofErr w:type="spellEnd"/>
+      <w:r>
+        <w:rPr>
+          <w:sz w:val="24"/>
+          <w:szCs w:val="24"/>
+        </w:rPr>
+        <w:t xml:space="preserve"> </w:t>
+      </w:r>
+      <w:proofErr w:type="spellStart"/>
+      <w:r>
+        <w:rPr>
+          <w:sz w:val="24"/>
+          <w:szCs w:val="24"/>
+        </w:rPr>
+        <w:t>their</w:t>
+      </w:r>
+      <w:proofErr w:type="spellEnd"/>
+      <w:r>
+        <w:rPr>
+          <w:sz w:val="24"/>
+          <w:szCs w:val="24"/>
+        </w:rPr>
+        <w:t xml:space="preserve"> </w:t>
+      </w:r>
+      <w:proofErr w:type="spellStart"/>
+      <w:r>
+        <w:rPr>
+          <w:sz w:val="24"/>
+          <w:szCs w:val="24"/>
+        </w:rPr>
+        <w:t>genre</w:t>
+      </w:r>
+      <w:proofErr w:type="spellEnd"/>
+      <w:r>
+        <w:rPr>
+          <w:sz w:val="24"/>
+          <w:szCs w:val="24"/>
+        </w:rPr>
+        <w:t xml:space="preserve"> </w:t>
+      </w:r>
+      <w:proofErr w:type="spellStart"/>
+      <w:r>
+        <w:rPr>
+          <w:sz w:val="24"/>
+          <w:szCs w:val="24"/>
+        </w:rPr>
+        <w:t>profiles</w:t>
+      </w:r>
+      <w:proofErr w:type="spellEnd"/>
+      <w:r>
+        <w:rPr>
+          <w:sz w:val="24"/>
+          <w:szCs w:val="24"/>
+        </w:rPr>
+        <w:t xml:space="preserve"> </w:t>
+      </w:r>
+      <w:proofErr w:type="spellStart"/>
+      <w:r>
+        <w:rPr>
+          <w:sz w:val="24"/>
+          <w:szCs w:val="24"/>
+        </w:rPr>
+        <w:t>overlap</w:t>
+      </w:r>
+      <w:proofErr w:type="spellEnd"/>
+      <w:r>
+        <w:rPr>
+          <w:sz w:val="24"/>
+          <w:szCs w:val="24"/>
+        </w:rPr>
+        <w:t xml:space="preserve"> with </w:t>
+      </w:r>
+      <w:proofErr w:type="spellStart"/>
+      <w:r>
+        <w:rPr>
+          <w:sz w:val="24"/>
+          <w:szCs w:val="24"/>
+        </w:rPr>
+        <w:t>many</w:t>
+      </w:r>
+      <w:proofErr w:type="spellEnd"/>
+      <w:r>
+        <w:rPr>
+          <w:sz w:val="24"/>
+          <w:szCs w:val="24"/>
+        </w:rPr>
+        <w:t xml:space="preserve"> </w:t>
+      </w:r>
+      <w:proofErr w:type="spellStart"/>
+      <w:r>
+        <w:rPr>
+          <w:sz w:val="24"/>
+          <w:szCs w:val="24"/>
+        </w:rPr>
+        <w:t>other</w:t>
+      </w:r>
+      <w:proofErr w:type="spellEnd"/>
+      <w:r>
+        <w:rPr>
+          <w:sz w:val="24"/>
+          <w:szCs w:val="24"/>
+        </w:rPr>
+        <w:t xml:space="preserve"> anime. High degree </w:t>
+      </w:r>
+      <w:proofErr w:type="spellStart"/>
+      <w:r>
+        <w:rPr>
+          <w:sz w:val="24"/>
+          <w:szCs w:val="24"/>
+        </w:rPr>
+        <w:t>centrality</w:t>
+      </w:r>
+      <w:proofErr w:type="spellEnd"/>
+      <w:r>
+        <w:rPr>
+          <w:sz w:val="24"/>
+          <w:szCs w:val="24"/>
+        </w:rPr>
+        <w:t xml:space="preserve"> </w:t>
+      </w:r>
+      <w:proofErr w:type="spellStart"/>
+      <w:r>
+        <w:rPr>
+          <w:sz w:val="24"/>
+          <w:szCs w:val="24"/>
+        </w:rPr>
+        <w:t>indicates</w:t>
+      </w:r>
+      <w:proofErr w:type="spellEnd"/>
+      <w:r>
+        <w:rPr>
+          <w:sz w:val="24"/>
+          <w:szCs w:val="24"/>
+        </w:rPr>
+        <w:t xml:space="preserve"> </w:t>
+      </w:r>
+      <w:proofErr w:type="spellStart"/>
+      <w:r>
+        <w:rPr>
+          <w:sz w:val="24"/>
+          <w:szCs w:val="24"/>
+        </w:rPr>
+        <w:t>structural</w:t>
+      </w:r>
+      <w:proofErr w:type="spellEnd"/>
+      <w:r>
+        <w:rPr>
+          <w:sz w:val="24"/>
+          <w:szCs w:val="24"/>
+        </w:rPr>
+        <w:t xml:space="preserve"> </w:t>
+      </w:r>
+      <w:proofErr w:type="spellStart"/>
+      <w:r>
+        <w:rPr>
+          <w:sz w:val="24"/>
+          <w:szCs w:val="24"/>
+        </w:rPr>
+        <w:t>importance</w:t>
+      </w:r>
+      <w:proofErr w:type="spellEnd"/>
+      <w:r>
+        <w:rPr>
+          <w:sz w:val="24"/>
+          <w:szCs w:val="24"/>
+        </w:rPr>
+        <w:t xml:space="preserve"> in the network </w:t>
+      </w:r>
+      <w:proofErr w:type="spellStart"/>
+      <w:r>
+        <w:rPr>
+          <w:sz w:val="24"/>
+          <w:szCs w:val="24"/>
+        </w:rPr>
+        <w:t>rather</w:t>
+      </w:r>
+      <w:proofErr w:type="spellEnd"/>
+      <w:r>
+        <w:rPr>
+          <w:sz w:val="24"/>
+          <w:szCs w:val="24"/>
+        </w:rPr>
+        <w:t xml:space="preserve"> </w:t>
+      </w:r>
+      <w:proofErr w:type="spellStart"/>
+      <w:r>
+        <w:rPr>
+          <w:sz w:val="24"/>
+          <w:szCs w:val="24"/>
+        </w:rPr>
+        <w:t>than</w:t>
+      </w:r>
+      <w:proofErr w:type="spellEnd"/>
+      <w:r>
+        <w:rPr>
+          <w:sz w:val="24"/>
+          <w:szCs w:val="24"/>
+        </w:rPr>
+        <w:t xml:space="preserve"> </w:t>
+      </w:r>
+      <w:proofErr w:type="spellStart"/>
+      <w:r>
+        <w:rPr>
+          <w:sz w:val="24"/>
+          <w:szCs w:val="24"/>
+        </w:rPr>
+        <w:t>popularity</w:t>
+      </w:r>
+      <w:proofErr w:type="spellEnd"/>
+      <w:r>
+        <w:rPr>
+          <w:sz w:val="24"/>
+          <w:szCs w:val="24"/>
+        </w:rPr>
+        <w:t xml:space="preserve"> or rating.</w:t>
+      </w:r>
+      <w:r>
+        <w:rPr>
+          <w:sz w:val="24"/>
+          <w:szCs w:val="24"/>
+        </w:rPr>
+        <w:drawing>
+          <wp:inline distT="0" distB="0" distL="0" distR="0" wp14:anchorId="6B0A7B2B" wp14:editId="21B8E0C3">
+            <wp:extent cx="2801721" cy="1793101"/>
+            <wp:effectExtent l="0" t="0" r="0" b="0"/>
+            <wp:docPr id="3" name="Immagine 3"/>
+            <wp:cNvGraphicFramePr>
+              <a:graphicFrameLocks xmlns:a="http://schemas.openxmlformats.org/drawingml/2006/main" noChangeAspect="1"/>
+            </wp:cNvGraphicFramePr>
+            <a:graphic xmlns:a="http://schemas.openxmlformats.org/drawingml/2006/main">
+              <a:graphicData uri="http://schemas.openxmlformats.org/drawingml/2006/picture">
+                <pic:pic xmlns:pic="http://schemas.openxmlformats.org/drawingml/2006/picture">
+                  <pic:nvPicPr>
+                    <pic:cNvPr id="1" name=""/>
+                    <pic:cNvPicPr/>
+                  </pic:nvPicPr>
+                  <pic:blipFill>
+                    <a:blip r:embed="rId10"/>
+                    <a:stretch>
+                      <a:fillRect/>
+                    </a:stretch>
+                  </pic:blipFill>
+                  <pic:spPr>
+                    <a:xfrm>
+                      <a:off x="0" y="0"/>
+                      <a:ext cx="2808424" cy="1797391"/>
+                    </a:xfrm>
+                    <a:prstGeom prst="rect">
+                      <a:avLst/>
+                    </a:prstGeom>
+                  </pic:spPr>
+                </pic:pic>
+              </a:graphicData>
+            </a:graphic>
+          </wp:inline>
+        </w:drawing>
+      </w:r>
+    </w:p>
+    <w:p>
+      <w:pPr>
+        <w:pStyle w:val="Didascalia"/>
+        <w:rPr>
+          <w:sz w:val="24"/>
+          <w:szCs w:val="24"/>
+        </w:rPr>
+      </w:pPr>
+      <w:r>
+        <w:t xml:space="preserve">Figure </w:t>
+      </w:r>
+      <w:r>
+        <w:fldChar w:fldCharType="begin"/>
+      </w:r>
+      <w:r>
+        <w:instrText xml:space="preserve"> SEQ Figure \* ARABIC </w:instrText>
+      </w:r>
+      <w:r>
+        <w:fldChar w:fldCharType="separate"/>
+      </w:r>
+      <w:r>
+        <w:rPr>
+          <w:noProof/>
+        </w:rPr>
+        <w:t>3</w:t>
+      </w:r>
+      <w:r>
+        <w:fldChar w:fldCharType="end"/>
+      </w:r>
+      <w:r>
+        <w:t xml:space="preserve">: Degree </w:t>
+      </w:r>
+      <w:proofErr w:type="spellStart"/>
+      <w:r>
+        <w:t>centrality</w:t>
+      </w:r>
+      <w:proofErr w:type="spellEnd"/>
     </w:p>
     <w:p>
       <w:pPr>
@@ -4623,151 +5775,7 @@
           <w:sz w:val="24"/>
           <w:szCs w:val="24"/>
         </w:rPr>
-        <w:t xml:space="preserve">. The network </w:t>
-      </w:r>
-      <w:proofErr w:type="spellStart"/>
-      <w:r>
-        <w:rPr>
-          <w:sz w:val="24"/>
-          <w:szCs w:val="24"/>
-        </w:rPr>
-        <w:t>consists</w:t>
-      </w:r>
-      <w:proofErr w:type="spellEnd"/>
-      <w:r>
-        <w:rPr>
-          <w:sz w:val="24"/>
-          <w:szCs w:val="24"/>
-        </w:rPr>
-        <w:t xml:space="preserve"> of 3579 </w:t>
-      </w:r>
-      <w:proofErr w:type="spellStart"/>
-      <w:r>
-        <w:rPr>
-          <w:sz w:val="24"/>
-          <w:szCs w:val="24"/>
-        </w:rPr>
-        <w:t>nodes</w:t>
-      </w:r>
-      <w:proofErr w:type="spellEnd"/>
-      <w:r>
-        <w:rPr>
-          <w:sz w:val="24"/>
-          <w:szCs w:val="24"/>
-        </w:rPr>
-        <w:t xml:space="preserve"> and 780393 </w:t>
-      </w:r>
-      <w:proofErr w:type="spellStart"/>
-      <w:r>
-        <w:rPr>
-          <w:sz w:val="24"/>
-          <w:szCs w:val="24"/>
-        </w:rPr>
-        <w:t>edges</w:t>
-      </w:r>
-      <w:proofErr w:type="spellEnd"/>
-      <w:r>
-        <w:rPr>
-          <w:sz w:val="24"/>
-          <w:szCs w:val="24"/>
-        </w:rPr>
-        <w:t xml:space="preserve">, </w:t>
-      </w:r>
-      <w:proofErr w:type="spellStart"/>
-      <w:r>
-        <w:rPr>
-          <w:sz w:val="24"/>
-          <w:szCs w:val="24"/>
-        </w:rPr>
-        <w:t>indicating</w:t>
-      </w:r>
-      <w:proofErr w:type="spellEnd"/>
-      <w:r>
-        <w:rPr>
-          <w:sz w:val="24"/>
-          <w:szCs w:val="24"/>
-        </w:rPr>
-        <w:t xml:space="preserve"> a </w:t>
-      </w:r>
-      <w:proofErr w:type="spellStart"/>
-      <w:r>
-        <w:rPr>
-          <w:sz w:val="24"/>
-          <w:szCs w:val="24"/>
-        </w:rPr>
-        <w:t>highly</w:t>
-      </w:r>
-      <w:proofErr w:type="spellEnd"/>
-      <w:r>
-        <w:rPr>
-          <w:sz w:val="24"/>
-          <w:szCs w:val="24"/>
-        </w:rPr>
-        <w:t xml:space="preserve"> </w:t>
-      </w:r>
-      <w:proofErr w:type="spellStart"/>
-      <w:r>
-        <w:rPr>
-          <w:sz w:val="24"/>
-          <w:szCs w:val="24"/>
-        </w:rPr>
-        <w:t>connected</w:t>
-      </w:r>
-      <w:proofErr w:type="spellEnd"/>
-      <w:r>
-        <w:rPr>
-          <w:sz w:val="24"/>
-          <w:szCs w:val="24"/>
-        </w:rPr>
-        <w:t xml:space="preserve"> </w:t>
-      </w:r>
-      <w:proofErr w:type="spellStart"/>
-      <w:r>
-        <w:rPr>
-          <w:sz w:val="24"/>
-          <w:szCs w:val="24"/>
-        </w:rPr>
-        <w:t>structure</w:t>
-      </w:r>
-      <w:proofErr w:type="spellEnd"/>
-      <w:r>
-        <w:rPr>
-          <w:sz w:val="24"/>
-          <w:szCs w:val="24"/>
-        </w:rPr>
-        <w:t xml:space="preserve"> </w:t>
-      </w:r>
-      <w:proofErr w:type="spellStart"/>
-      <w:r>
-        <w:rPr>
-          <w:sz w:val="24"/>
-          <w:szCs w:val="24"/>
-        </w:rPr>
-        <w:t>resulting</w:t>
-      </w:r>
-      <w:proofErr w:type="spellEnd"/>
-      <w:r>
-        <w:rPr>
-          <w:sz w:val="24"/>
-          <w:szCs w:val="24"/>
-        </w:rPr>
-        <w:t xml:space="preserve"> from the </w:t>
-      </w:r>
-      <w:proofErr w:type="spellStart"/>
-      <w:r>
-        <w:rPr>
-          <w:sz w:val="24"/>
-          <w:szCs w:val="24"/>
-        </w:rPr>
-        <w:t>similarity</w:t>
-      </w:r>
-      <w:proofErr w:type="spellEnd"/>
-      <w:r>
-        <w:rPr>
-          <w:sz w:val="24"/>
-          <w:szCs w:val="24"/>
-        </w:rPr>
-        <w:t xml:space="preserve"> rule.</w:t>
+        <w:t>.</w:t>
       </w:r>
     </w:p>
     <w:p>
@@ -4912,7 +5920,21 @@
           <w:sz w:val="24"/>
           <w:szCs w:val="24"/>
         </w:rPr>
-        <w:t xml:space="preserve"> (436.09), </w:t>
+        <w:t xml:space="preserve"> (436</w:t>
+      </w:r>
+      <w:r>
+        <w:rPr>
+          <w:sz w:val="24"/>
+          <w:szCs w:val="24"/>
+        </w:rPr>
+        <w:t>.</w:t>
+      </w:r>
+      <w:r>
+        <w:rPr>
+          <w:sz w:val="24"/>
+          <w:szCs w:val="24"/>
+        </w:rPr>
+        <w:t xml:space="preserve">09), </w:t>
       </w:r>
       <w:proofErr w:type="spellStart"/>
       <w:r>
@@ -4928,7 +5950,21 @@
           <w:sz w:val="24"/>
           <w:szCs w:val="24"/>
         </w:rPr>
-        <w:t xml:space="preserve"> (329), and maximum degree (1767), </w:t>
+        <w:t xml:space="preserve"> (329), maximum degree (1767)</w:t>
+      </w:r>
+      <w:r>
+        <w:rPr>
+          <w:sz w:val="24"/>
+          <w:szCs w:val="24"/>
+        </w:rPr>
+        <w:t xml:space="preserve"> and minimum degree (0)</w:t>
+      </w:r>
+      <w:r>
+        <w:rPr>
+          <w:sz w:val="24"/>
+          <w:szCs w:val="24"/>
+        </w:rPr>
+        <w:t xml:space="preserve">, </w:t>
       </w:r>
       <w:proofErr w:type="spellStart"/>
       <w:r>
@@ -5275,9 +6311,11 @@
       </w:pPr>
       <w:r>
         <w:rPr>
-          <w:sz w:val="24"/>
-          <w:szCs w:val="24"/>
-        </w:rPr>
+          <w:noProof/>
+          <w:sz w:val="24"/>
+          <w:szCs w:val="24"/>
+        </w:rPr>
+        <w:lastRenderedPageBreak/>
         <w:drawing>
           <wp:inline distT="0" distB="0" distL="0" distR="0" wp14:anchorId="363B0130" wp14:editId="10A9509A">
             <wp:extent cx="2311400" cy="1562735"/>
@@ -5294,7 +6332,7 @@
                     <pic:cNvPicPr/>
                   </pic:nvPicPr>
                   <pic:blipFill>
-                    <a:blip r:embed="rId8" cstate="print">
+                    <a:blip r:embed="rId11" cstate="print">
                       <a:extLst>
                         <a:ext uri="{28A0092B-C50C-407E-A947-70E740481C1C}">
                           <a14:useLocalDpi xmlns:a14="http://schemas.microsoft.com/office/drawing/2010/main" val="0"/>
@@ -5346,7 +6384,7 @@
         <w:rPr>
           <w:noProof/>
         </w:rPr>
-        <w:t>3</w:t>
+        <w:t>4</w:t>
       </w:r>
       <w:r>
         <w:fldChar w:fldCharType="end"/>
@@ -5724,6 +6762,7 @@
       </w:r>
     </w:p>
     <w:sectPr>
+      <w:footerReference w:type="default" r:id="rId12"/>
       <w:pgSz w:w="11906" w:h="16838"/>
       <w:pgMar w:top="1417" w:right="1134" w:bottom="1134" w:left="1134" w:header="708" w:footer="708" w:gutter="0"/>
       <w:cols w:space="708"/>
@@ -5731,6 +6770,98 @@
     </w:sectPr>
   </w:body>
 </w:document>
+</file>
+
+<file path=word/endnotes.xml><?xml version="1.0" encoding="utf-8"?>
+<w:endnotes xmlns:wpc="http://schemas.microsoft.com/office/word/2010/wordprocessingCanvas" xmlns:cx="http://schemas.microsoft.com/office/drawing/2014/chartex" xmlns:cx1="http://schemas.microsoft.com/office/drawing/2015/9/8/chartex" xmlns:cx2="http://schemas.microsoft.com/office/drawing/2015/10/21/chartex" xmlns:cx3="http://schemas.microsoft.com/office/drawing/2016/5/9/chartex" xmlns:cx4="http://schemas.microsoft.com/office/drawing/2016/5/10/chartex" xmlns:cx5="http://schemas.microsoft.com/office/drawing/2016/5/11/chartex" xmlns:cx6="http://schemas.microsoft.com/office/drawing/2016/5/12/chartex" xmlns:cx7="http://schemas.microsoft.com/office/drawing/2016/5/13/chartex" xmlns:cx8="http://schemas.microsoft.com/office/drawing/2016/5/14/chartex" xmlns:mc="http://schemas.openxmlformats.org/markup-compatibility/2006" xmlns:aink="http://schemas.microsoft.com/office/drawing/2016/ink" xmlns:am3d="http://schemas.microsoft.com/office/drawing/2017/model3d" xmlns:o="urn:schemas-microsoft-com:office:office" xmlns:oel="http://schemas.microsoft.com/office/2019/extlst" xmlns:r="http://schemas.openxmlformats.org/officeDocument/2006/relationships" xmlns:m="http://schemas.openxmlformats.org/officeDocument/2006/math" xmlns:v="urn:schemas-microsoft-com:vml" xmlns:wp14="http://schemas.microsoft.com/office/word/2010/wordprocessingDrawing" xmlns:wp="http://schemas.openxmlformats.org/drawingml/2006/wordprocessingDrawing" xmlns:w10="urn:schemas-microsoft-com:office:word" xmlns:w="http://schemas.openxmlformats.org/wordprocessingml/2006/main" xmlns:w14="http://schemas.microsoft.com/office/word/2010/wordml" xmlns:w15="http://schemas.microsoft.com/office/word/2012/wordml" xmlns:w16cex="http://schemas.microsoft.com/office/word/2018/wordml/cex" xmlns:w16cid="http://schemas.microsoft.com/office/word/2016/wordml/cid" xmlns:w16="http://schemas.microsoft.com/office/word/2018/wordml" xmlns:w16sdtdh="http://schemas.microsoft.com/office/word/2020/wordml/sdtdatahash" xmlns:w16se="http://schemas.microsoft.com/office/word/2015/wordml/symex" xmlns:wpg="http://schemas.microsoft.com/office/word/2010/wordprocessingGroup" xmlns:wpi="http://schemas.microsoft.com/office/word/2010/wordprocessingInk" xmlns:wne="http://schemas.microsoft.com/office/word/2006/wordml" xmlns:wps="http://schemas.microsoft.com/office/word/2010/wordprocessingShape" mc:Ignorable="w14 w15 w16se w16cid w16 w16cex w16sdtdh wp14">
+  <w:endnote w:type="separator" w:id="-1">
+    <w:p>
+      <w:pPr>
+        <w:spacing w:after="0" w:line="240" w:lineRule="auto"/>
+      </w:pPr>
+      <w:r>
+        <w:separator/>
+      </w:r>
+    </w:p>
+  </w:endnote>
+  <w:endnote w:type="continuationSeparator" w:id="0">
+    <w:p>
+      <w:pPr>
+        <w:spacing w:after="0" w:line="240" w:lineRule="auto"/>
+      </w:pPr>
+      <w:r>
+        <w:continuationSeparator/>
+      </w:r>
+    </w:p>
+  </w:endnote>
+</w:endnotes>
+</file>
+
+<file path=word/footer1.xml><?xml version="1.0" encoding="utf-8"?>
+<w:ftr xmlns:wpc="http://schemas.microsoft.com/office/word/2010/wordprocessingCanvas" xmlns:cx="http://schemas.microsoft.com/office/drawing/2014/chartex" xmlns:cx1="http://schemas.microsoft.com/office/drawing/2015/9/8/chartex" xmlns:cx2="http://schemas.microsoft.com/office/drawing/2015/10/21/chartex" xmlns:cx3="http://schemas.microsoft.com/office/drawing/2016/5/9/chartex" xmlns:cx4="http://schemas.microsoft.com/office/drawing/2016/5/10/chartex" xmlns:cx5="http://schemas.microsoft.com/office/drawing/2016/5/11/chartex" xmlns:cx6="http://schemas.microsoft.com/office/drawing/2016/5/12/chartex" xmlns:cx7="http://schemas.microsoft.com/office/drawing/2016/5/13/chartex" xmlns:cx8="http://schemas.microsoft.com/office/drawing/2016/5/14/chartex" xmlns:mc="http://schemas.openxmlformats.org/markup-compatibility/2006" xmlns:aink="http://schemas.microsoft.com/office/drawing/2016/ink" xmlns:am3d="http://schemas.microsoft.com/office/drawing/2017/model3d" xmlns:o="urn:schemas-microsoft-com:office:office" xmlns:oel="http://schemas.microsoft.com/office/2019/extlst" xmlns:r="http://schemas.openxmlformats.org/officeDocument/2006/relationships" xmlns:m="http://schemas.openxmlformats.org/officeDocument/2006/math" xmlns:v="urn:schemas-microsoft-com:vml" xmlns:wp14="http://schemas.microsoft.com/office/word/2010/wordprocessingDrawing" xmlns:wp="http://schemas.openxmlformats.org/drawingml/2006/wordprocessingDrawing" xmlns:w10="urn:schemas-microsoft-com:office:word" xmlns:w="http://schemas.openxmlformats.org/wordprocessingml/2006/main" xmlns:w14="http://schemas.microsoft.com/office/word/2010/wordml" xmlns:w15="http://schemas.microsoft.com/office/word/2012/wordml" xmlns:w16cex="http://schemas.microsoft.com/office/word/2018/wordml/cex" xmlns:w16cid="http://schemas.microsoft.com/office/word/2016/wordml/cid" xmlns:w16="http://schemas.microsoft.com/office/word/2018/wordml" xmlns:w16sdtdh="http://schemas.microsoft.com/office/word/2020/wordml/sdtdatahash" xmlns:w16se="http://schemas.microsoft.com/office/word/2015/wordml/symex" xmlns:wpg="http://schemas.microsoft.com/office/word/2010/wordprocessingGroup" xmlns:wpi="http://schemas.microsoft.com/office/word/2010/wordprocessingInk" xmlns:wne="http://schemas.microsoft.com/office/word/2006/wordml" xmlns:wps="http://schemas.microsoft.com/office/word/2010/wordprocessingShape" mc:Ignorable="w14 w15 w16se w16cid w16 w16cex w16sdtdh wp14">
+  <w:sdt>
+    <w:sdtPr>
+      <w:id w:val="-1267618281"/>
+      <w:docPartObj>
+        <w:docPartGallery w:val="Page Numbers (Bottom of Page)"/>
+        <w:docPartUnique/>
+      </w:docPartObj>
+    </w:sdtPr>
+    <w:sdtContent>
+      <w:p>
+        <w:pPr>
+          <w:pStyle w:val="Pidipagina"/>
+          <w:jc w:val="right"/>
+        </w:pPr>
+        <w:r>
+          <w:fldChar w:fldCharType="begin"/>
+        </w:r>
+        <w:r>
+          <w:instrText>PAGE   \* MERGEFORMAT</w:instrText>
+        </w:r>
+        <w:r>
+          <w:fldChar w:fldCharType="separate"/>
+        </w:r>
+        <w:r>
+          <w:t>2</w:t>
+        </w:r>
+        <w:r>
+          <w:fldChar w:fldCharType="end"/>
+        </w:r>
+      </w:p>
+    </w:sdtContent>
+  </w:sdt>
+  <w:p>
+    <w:pPr>
+      <w:pStyle w:val="Pidipagina"/>
+    </w:pPr>
+  </w:p>
+</w:ftr>
+</file>
+
+<file path=word/footnotes.xml><?xml version="1.0" encoding="utf-8"?>
+<w:footnotes xmlns:wpc="http://schemas.microsoft.com/office/word/2010/wordprocessingCanvas" xmlns:cx="http://schemas.microsoft.com/office/drawing/2014/chartex" xmlns:cx1="http://schemas.microsoft.com/office/drawing/2015/9/8/chartex" xmlns:cx2="http://schemas.microsoft.com/office/drawing/2015/10/21/chartex" xmlns:cx3="http://schemas.microsoft.com/office/drawing/2016/5/9/chartex" xmlns:cx4="http://schemas.microsoft.com/office/drawing/2016/5/10/chartex" xmlns:cx5="http://schemas.microsoft.com/office/drawing/2016/5/11/chartex" xmlns:cx6="http://schemas.microsoft.com/office/drawing/2016/5/12/chartex" xmlns:cx7="http://schemas.microsoft.com/office/drawing/2016/5/13/chartex" xmlns:cx8="http://schemas.microsoft.com/office/drawing/2016/5/14/chartex" xmlns:mc="http://schemas.openxmlformats.org/markup-compatibility/2006" xmlns:aink="http://schemas.microsoft.com/office/drawing/2016/ink" xmlns:am3d="http://schemas.microsoft.com/office/drawing/2017/model3d" xmlns:o="urn:schemas-microsoft-com:office:office" xmlns:oel="http://schemas.microsoft.com/office/2019/extlst" xmlns:r="http://schemas.openxmlformats.org/officeDocument/2006/relationships" xmlns:m="http://schemas.openxmlformats.org/officeDocument/2006/math" xmlns:v="urn:schemas-microsoft-com:vml" xmlns:wp14="http://schemas.microsoft.com/office/word/2010/wordprocessingDrawing" xmlns:wp="http://schemas.openxmlformats.org/drawingml/2006/wordprocessingDrawing" xmlns:w10="urn:schemas-microsoft-com:office:word" xmlns:w="http://schemas.openxmlformats.org/wordprocessingml/2006/main" xmlns:w14="http://schemas.microsoft.com/office/word/2010/wordml" xmlns:w15="http://schemas.microsoft.com/office/word/2012/wordml" xmlns:w16cex="http://schemas.microsoft.com/office/word/2018/wordml/cex" xmlns:w16cid="http://schemas.microsoft.com/office/word/2016/wordml/cid" xmlns:w16="http://schemas.microsoft.com/office/word/2018/wordml" xmlns:w16sdtdh="http://schemas.microsoft.com/office/word/2020/wordml/sdtdatahash" xmlns:w16se="http://schemas.microsoft.com/office/word/2015/wordml/symex" xmlns:wpg="http://schemas.microsoft.com/office/word/2010/wordprocessingGroup" xmlns:wpi="http://schemas.microsoft.com/office/word/2010/wordprocessingInk" xmlns:wne="http://schemas.microsoft.com/office/word/2006/wordml" xmlns:wps="http://schemas.microsoft.com/office/word/2010/wordprocessingShape" mc:Ignorable="w14 w15 w16se w16cid w16 w16cex w16sdtdh wp14">
+  <w:footnote w:type="separator" w:id="-1">
+    <w:p>
+      <w:pPr>
+        <w:spacing w:after="0" w:line="240" w:lineRule="auto"/>
+      </w:pPr>
+      <w:r>
+        <w:separator/>
+      </w:r>
+    </w:p>
+  </w:footnote>
+  <w:footnote w:type="continuationSeparator" w:id="0">
+    <w:p>
+      <w:pPr>
+        <w:spacing w:after="0" w:line="240" w:lineRule="auto"/>
+      </w:pPr>
+      <w:r>
+        <w:continuationSeparator/>
+      </w:r>
+    </w:p>
+  </w:footnote>
+</w:footnotes>
 </file>
 
 <file path=word/numbering.xml><?xml version="1.0" encoding="utf-8"?>
@@ -14466,6 +15597,50 @@
       <w:szCs w:val="18"/>
     </w:rPr>
   </w:style>
+  <w:style w:type="paragraph" w:styleId="Intestazione">
+    <w:name w:val="header"/>
+    <w:basedOn w:val="Normale"/>
+    <w:link w:val="IntestazioneCarattere"/>
+    <w:uiPriority w:val="99"/>
+    <w:unhideWhenUsed/>
+    <w:rsid w:val="00D84C13"/>
+    <w:pPr>
+      <w:tabs>
+        <w:tab w:val="center" w:pos="4819"/>
+        <w:tab w:val="right" w:pos="9638"/>
+      </w:tabs>
+      <w:spacing w:after="0" w:line="240" w:lineRule="auto"/>
+    </w:pPr>
+  </w:style>
+  <w:style w:type="character" w:customStyle="1" w:styleId="IntestazioneCarattere">
+    <w:name w:val="Intestazione Carattere"/>
+    <w:basedOn w:val="Carpredefinitoparagrafo"/>
+    <w:link w:val="Intestazione"/>
+    <w:uiPriority w:val="99"/>
+    <w:rsid w:val="00D84C13"/>
+  </w:style>
+  <w:style w:type="paragraph" w:styleId="Pidipagina">
+    <w:name w:val="footer"/>
+    <w:basedOn w:val="Normale"/>
+    <w:link w:val="PidipaginaCarattere"/>
+    <w:uiPriority w:val="99"/>
+    <w:unhideWhenUsed/>
+    <w:rsid w:val="00D84C13"/>
+    <w:pPr>
+      <w:tabs>
+        <w:tab w:val="center" w:pos="4819"/>
+        <w:tab w:val="right" w:pos="9638"/>
+      </w:tabs>
+      <w:spacing w:after="0" w:line="240" w:lineRule="auto"/>
+    </w:pPr>
+  </w:style>
+  <w:style w:type="character" w:customStyle="1" w:styleId="PidipaginaCarattere">
+    <w:name w:val="Piè di pagina Carattere"/>
+    <w:basedOn w:val="Carpredefinitoparagrafo"/>
+    <w:link w:val="Pidipagina"/>
+    <w:uiPriority w:val="99"/>
+    <w:rsid w:val="00D84C13"/>
+  </w:style>
 </w:styles>
 </file>
 

</xml_diff>